<commit_message>
docs: dossier projet final avec les 15 captures d'ecran (interfaces, e-mail, tests, lighthouse, RGPD)
</commit_message>
<xml_diff>
--- a/docs/livrables-soutenance/02-dossier-projet/Dossier_Projet_Vite_Gourmand_2026.docx
+++ b/docs/livrables-soutenance/02-dossier-projet/Dossier_Projet_Vite_Gourmand_2026.docx
@@ -10805,10 +10805,63 @@
     </w:p>
     <w:p>
       <w:pPr>
-        <w:pStyle w:val="BodyText"/>
-      </w:pPr>
-      <w:r>
-        <w:t xml:space="preserve">[Insérer capture : tableau de bord des statistiques – graphique CA par menu]</w:t>
+        <w:jc w:val="center"/>
+      </w:pPr>
+      <w:r>
+        <w:drawing>
+          <wp:inline distT="0" distB="0" distL="0" distR="0">
+            <wp:extent cx="5303520" cy="3033600"/>
+            <wp:effectExtent l="0" t="0" r="0" b="0"/>
+            <wp:docPr id="301" name="Statistiques NoSQL"/>
+            <wp:cNvGraphicFramePr>
+              <a:graphicFrameLocks xmlns:a="http://schemas.openxmlformats.org/drawingml/2006/main" noChangeAspect="1"/>
+            </wp:cNvGraphicFramePr>
+            <a:graphic xmlns:a="http://schemas.openxmlformats.org/drawingml/2006/main">
+              <a:graphicData uri="http://schemas.openxmlformats.org/drawingml/2006/picture">
+                <pic:pic xmlns:pic="http://schemas.openxmlformats.org/drawingml/2006/picture">
+                  <pic:nvPicPr>
+                    <pic:cNvPr id="301" name="Statistiques NoSQL"/>
+                    <pic:cNvPicPr/>
+                  </pic:nvPicPr>
+                  <pic:blipFill>
+                    <a:blip r:embed="rId37"/>
+                    <a:stretch>
+                      <a:fillRect/>
+                    </a:stretch>
+                  </pic:blipFill>
+                  <pic:spPr>
+                    <a:xfrm>
+                      <a:off x="0" y="0"/>
+                      <a:ext cx="5303520" cy="3033600"/>
+                    </a:xfrm>
+                    <a:prstGeom prst="rect">
+                      <a:avLst/>
+                    </a:prstGeom>
+                    <a:ln w="9525">
+                      <a:solidFill>
+                        <a:srgbClr val="CCCCCC"/>
+                      </a:solidFill>
+                    </a:ln>
+                  </pic:spPr>
+                </pic:pic>
+              </a:graphicData>
+            </a:graphic>
+          </wp:inline>
+        </w:drawing>
+      </w:r>
+    </w:p>
+    <w:p>
+      <w:pPr>
+        <w:spacing w:after="240"/>
+        <w:jc w:val="center"/>
+      </w:pPr>
+      <w:r>
+        <w:rPr>
+          <w:i/>
+          <w:sz w:val="18"/>
+          <w:color w:val="666666"/>
+        </w:rPr>
+        <w:t xml:space="preserve">Figure : Tableau de bord des statistiques – graphique du chiffre d’affaires et du nombre de commandes par menu (données issues de MongoDB).</w:t>
       </w:r>
     </w:p>
     <w:bookmarkEnd w:id="52"/>
@@ -27764,10 +27817,64 @@
     </w:p>
     <w:p>
       <w:pPr>
-        <w:pStyle w:val="BodyText"/>
-      </w:pPr>
-      <w:r>
-        <w:t xml:space="preserve">[Insérer capture : e-mail de confirmation de commande reçu]</w:t>
+        <w:keepNext/>
+        <w:jc w:val="center"/>
+      </w:pPr>
+      <w:r>
+        <w:drawing>
+          <wp:inline distT="0" distB="0" distL="0" distR="0">
+            <wp:extent cx="5303520" cy="2826776"/>
+            <wp:effectExtent l="0" t="0" r="0" b="0"/>
+            <wp:docPr id="401" name="E-mail Resend Delivered"/>
+            <wp:cNvGraphicFramePr>
+              <a:graphicFrameLocks xmlns:a="http://schemas.openxmlformats.org/drawingml/2006/main" noChangeAspect="1"/>
+            </wp:cNvGraphicFramePr>
+            <a:graphic xmlns:a="http://schemas.openxmlformats.org/drawingml/2006/main">
+              <a:graphicData uri="http://schemas.openxmlformats.org/drawingml/2006/picture">
+                <pic:pic xmlns:pic="http://schemas.openxmlformats.org/drawingml/2006/picture">
+                  <pic:nvPicPr>
+                    <pic:cNvPr id="401" name="E-mail Resend Delivered"/>
+                    <pic:cNvPicPr/>
+                  </pic:nvPicPr>
+                  <pic:blipFill>
+                    <a:blip r:embed="rId40"/>
+                    <a:stretch>
+                      <a:fillRect/>
+                    </a:stretch>
+                  </pic:blipFill>
+                  <pic:spPr>
+                    <a:xfrm>
+                      <a:off x="0" y="0"/>
+                      <a:ext cx="5303520" cy="2826776"/>
+                    </a:xfrm>
+                    <a:prstGeom prst="rect">
+                      <a:avLst/>
+                    </a:prstGeom>
+                    <a:ln w="9525">
+                      <a:solidFill>
+                        <a:srgbClr val="CCCCCC"/>
+                      </a:solidFill>
+                    </a:ln>
+                  </pic:spPr>
+                </pic:pic>
+              </a:graphicData>
+            </a:graphic>
+          </wp:inline>
+        </w:drawing>
+      </w:r>
+    </w:p>
+    <w:p>
+      <w:pPr>
+        <w:spacing w:after="240"/>
+        <w:jc w:val="center"/>
+      </w:pPr>
+      <w:r>
+        <w:rPr>
+          <w:i/>
+          <w:sz w:val="18"/>
+          <w:color w:val="666666"/>
+        </w:rPr>
+        <w:t xml:space="preserve">Figure : E-mail de notification envoyé via Resend depuis noreply@vite-gourmand.fr – statut « Delivered » confirmé.</w:t>
       </w:r>
     </w:p>
     <w:bookmarkEnd w:id="97"/>
@@ -28104,10 +28211,64 @@
     </w:p>
     <w:p>
       <w:pPr>
-        <w:pStyle w:val="FirstParagraph"/>
-      </w:pPr>
-      <w:r>
-        <w:t xml:space="preserve">[Insérer capture : sortie de « php artisan test » – 18 tests verts]</w:t>
+        <w:keepNext/>
+        <w:jc w:val="center"/>
+      </w:pPr>
+      <w:r>
+        <w:drawing>
+          <wp:inline distT="0" distB="0" distL="0" distR="0">
+            <wp:extent cx="5000000" cy="2730000"/>
+            <wp:effectExtent l="0" t="0" r="0" b="0"/>
+            <wp:docPr id="403" name="Tests automatises"/>
+            <wp:cNvGraphicFramePr>
+              <a:graphicFrameLocks xmlns:a="http://schemas.openxmlformats.org/drawingml/2006/main" noChangeAspect="1"/>
+            </wp:cNvGraphicFramePr>
+            <a:graphic xmlns:a="http://schemas.openxmlformats.org/drawingml/2006/main">
+              <a:graphicData uri="http://schemas.openxmlformats.org/drawingml/2006/picture">
+                <pic:pic xmlns:pic="http://schemas.openxmlformats.org/drawingml/2006/picture">
+                  <pic:nvPicPr>
+                    <pic:cNvPr id="403" name="Tests automatises"/>
+                    <pic:cNvPicPr/>
+                  </pic:nvPicPr>
+                  <pic:blipFill>
+                    <a:blip r:embed="rId44"/>
+                    <a:stretch>
+                      <a:fillRect/>
+                    </a:stretch>
+                  </pic:blipFill>
+                  <pic:spPr>
+                    <a:xfrm>
+                      <a:off x="0" y="0"/>
+                      <a:ext cx="5000000" cy="2730000"/>
+                    </a:xfrm>
+                    <a:prstGeom prst="rect">
+                      <a:avLst/>
+                    </a:prstGeom>
+                    <a:ln w="9525">
+                      <a:solidFill>
+                        <a:srgbClr val="CCCCCC"/>
+                      </a:solidFill>
+                    </a:ln>
+                  </pic:spPr>
+                </pic:pic>
+              </a:graphicData>
+            </a:graphic>
+          </wp:inline>
+        </w:drawing>
+      </w:r>
+    </w:p>
+    <w:p>
+      <w:pPr>
+        <w:spacing w:after="240"/>
+        <w:jc w:val="center"/>
+      </w:pPr>
+      <w:r>
+        <w:rPr>
+          <w:i/>
+          <w:sz w:val="18"/>
+          <w:color w:val="666666"/>
+        </w:rPr>
+        <w:t xml:space="preserve">Figure : Exécution de la suite de tests automatisés (php artisan test) – 18 tests passés, 64 assertions.</w:t>
       </w:r>
     </w:p>
     <w:bookmarkEnd w:id="102"/>
@@ -33411,10 +33572,63 @@
     </w:p>
     <w:p>
       <w:pPr>
-        <w:pStyle w:val="BodyText"/>
-      </w:pPr>
-      <w:r>
-        <w:t xml:space="preserve">[Insérer capture : dashboard administrateur]</w:t>
+        <w:jc w:val="center"/>
+      </w:pPr>
+      <w:r>
+        <w:drawing>
+          <wp:inline distT="0" distB="0" distL="0" distR="0">
+            <wp:extent cx="5303520" cy="3033600"/>
+            <wp:effectExtent l="0" t="0" r="0" b="0"/>
+            <wp:docPr id="302" name="Dashboard administrateur"/>
+            <wp:cNvGraphicFramePr>
+              <a:graphicFrameLocks xmlns:a="http://schemas.openxmlformats.org/drawingml/2006/main" noChangeAspect="1"/>
+            </wp:cNvGraphicFramePr>
+            <a:graphic xmlns:a="http://schemas.openxmlformats.org/drawingml/2006/main">
+              <a:graphicData uri="http://schemas.openxmlformats.org/drawingml/2006/picture">
+                <pic:pic xmlns:pic="http://schemas.openxmlformats.org/drawingml/2006/picture">
+                  <pic:nvPicPr>
+                    <pic:cNvPr id="302" name="Dashboard administrateur"/>
+                    <pic:cNvPicPr/>
+                  </pic:nvPicPr>
+                  <pic:blipFill>
+                    <a:blip r:embed="rId36"/>
+                    <a:stretch>
+                      <a:fillRect/>
+                    </a:stretch>
+                  </pic:blipFill>
+                  <pic:spPr>
+                    <a:xfrm>
+                      <a:off x="0" y="0"/>
+                      <a:ext cx="5303520" cy="3033600"/>
+                    </a:xfrm>
+                    <a:prstGeom prst="rect">
+                      <a:avLst/>
+                    </a:prstGeom>
+                    <a:ln w="9525">
+                      <a:solidFill>
+                        <a:srgbClr val="CCCCCC"/>
+                      </a:solidFill>
+                    </a:ln>
+                  </pic:spPr>
+                </pic:pic>
+              </a:graphicData>
+            </a:graphic>
+          </wp:inline>
+        </w:drawing>
+      </w:r>
+    </w:p>
+    <w:p>
+      <w:pPr>
+        <w:spacing w:after="240"/>
+        <w:jc w:val="center"/>
+      </w:pPr>
+      <w:r>
+        <w:rPr>
+          <w:i/>
+          <w:sz w:val="18"/>
+          <w:color w:val="666666"/>
+        </w:rPr>
+        <w:t xml:space="preserve">Figure : Tableau de bord administrateur – gestion des commandes et accès aux espaces d’administration.</w:t>
       </w:r>
     </w:p>
     <w:bookmarkEnd w:id="137"/>
@@ -33714,10 +33928,64 @@
     </w:p>
     <w:p>
       <w:pPr>
-        <w:pStyle w:val="FirstParagraph"/>
-      </w:pPr>
-      <w:r>
-        <w:t xml:space="preserve">[Insérer capture : audit Lighthouse / onglet Accessibilité]</w:t>
+        <w:keepNext/>
+        <w:jc w:val="center"/>
+      </w:pPr>
+      <w:r>
+        <w:drawing>
+          <wp:inline distT="0" distB="0" distL="0" distR="0">
+            <wp:extent cx="4200000" cy="1948800"/>
+            <wp:effectExtent l="0" t="0" r="0" b="0"/>
+            <wp:docPr id="402" name="Audit Lighthouse"/>
+            <wp:cNvGraphicFramePr>
+              <a:graphicFrameLocks xmlns:a="http://schemas.openxmlformats.org/drawingml/2006/main" noChangeAspect="1"/>
+            </wp:cNvGraphicFramePr>
+            <a:graphic xmlns:a="http://schemas.openxmlformats.org/drawingml/2006/main">
+              <a:graphicData uri="http://schemas.openxmlformats.org/drawingml/2006/picture">
+                <pic:pic xmlns:pic="http://schemas.openxmlformats.org/drawingml/2006/picture">
+                  <pic:nvPicPr>
+                    <pic:cNvPr id="402" name="Audit Lighthouse"/>
+                    <pic:cNvPicPr/>
+                  </pic:nvPicPr>
+                  <pic:blipFill>
+                    <a:blip r:embed="rId42"/>
+                    <a:stretch>
+                      <a:fillRect/>
+                    </a:stretch>
+                  </pic:blipFill>
+                  <pic:spPr>
+                    <a:xfrm>
+                      <a:off x="0" y="0"/>
+                      <a:ext cx="4200000" cy="1948800"/>
+                    </a:xfrm>
+                    <a:prstGeom prst="rect">
+                      <a:avLst/>
+                    </a:prstGeom>
+                    <a:ln w="9525">
+                      <a:solidFill>
+                        <a:srgbClr val="CCCCCC"/>
+                      </a:solidFill>
+                    </a:ln>
+                  </pic:spPr>
+                </pic:pic>
+              </a:graphicData>
+            </a:graphic>
+          </wp:inline>
+        </w:drawing>
+      </w:r>
+    </w:p>
+    <w:p>
+      <w:pPr>
+        <w:spacing w:after="240"/>
+        <w:jc w:val="center"/>
+      </w:pPr>
+      <w:r>
+        <w:rPr>
+          <w:i/>
+          <w:sz w:val="18"/>
+          <w:color w:val="666666"/>
+        </w:rPr>
+        <w:t xml:space="preserve">Figure : Audit d’accessibilité Lighthouse – score de 95/100, 18 audits réussis (vite-gourmand.fr).</w:t>
       </w:r>
     </w:p>
     <w:bookmarkEnd w:id="139"/>
@@ -33750,7 +34018,627 @@
         <w:pStyle w:val="BodyText"/>
       </w:pPr>
       <w:r>
-        <w:t xml:space="preserve">Pages à capturer : page d’accueil, liste des menus, détail d’un menu, formulaire de commande, mes commandes (client), dashboard employé, dashboard administrateur, statistiques NoSQL, page RGPD « Mes données ».</w:t>
+        <w:t xml:space="preserve">Les captures ci-dessous présentent les principales interfaces de l’application en production, du parcours visiteur jusqu’aux espaces d’administration.</w:t>
+      </w:r>
+    </w:p>
+    <w:p>
+      <w:pPr>
+        <w:keepNext/>
+        <w:jc w:val="center"/>
+      </w:pPr>
+      <w:r>
+        <w:drawing>
+          <wp:inline distT="0" distB="0" distL="0" distR="0">
+            <wp:extent cx="5303520" cy="3033600"/>
+            <wp:effectExtent l="0" t="0" r="0" b="0"/>
+            <wp:docPr id="310" name="Accueil"/>
+            <wp:cNvGraphicFramePr>
+              <a:graphicFrameLocks xmlns:a="http://schemas.openxmlformats.org/drawingml/2006/main" noChangeAspect="1"/>
+            </wp:cNvGraphicFramePr>
+            <a:graphic xmlns:a="http://schemas.openxmlformats.org/drawingml/2006/main">
+              <a:graphicData uri="http://schemas.openxmlformats.org/drawingml/2006/picture">
+                <pic:pic xmlns:pic="http://schemas.openxmlformats.org/drawingml/2006/picture">
+                  <pic:nvPicPr>
+                    <pic:cNvPr id="310" name="Accueil"/>
+                    <pic:cNvPicPr/>
+                  </pic:nvPicPr>
+                  <pic:blipFill>
+                    <a:blip r:embed="rId30"/>
+                    <a:stretch>
+                      <a:fillRect/>
+                    </a:stretch>
+                  </pic:blipFill>
+                  <pic:spPr>
+                    <a:xfrm>
+                      <a:off x="0" y="0"/>
+                      <a:ext cx="5303520" cy="3033600"/>
+                    </a:xfrm>
+                    <a:prstGeom prst="rect">
+                      <a:avLst/>
+                    </a:prstGeom>
+                    <a:ln w="9525">
+                      <a:solidFill>
+                        <a:srgbClr val="CCCCCC"/>
+                      </a:solidFill>
+                    </a:ln>
+                  </pic:spPr>
+                </pic:pic>
+              </a:graphicData>
+            </a:graphic>
+          </wp:inline>
+        </w:drawing>
+      </w:r>
+    </w:p>
+    <w:p>
+      <w:pPr>
+        <w:spacing w:after="360"/>
+        <w:jc w:val="center"/>
+      </w:pPr>
+      <w:r>
+        <w:rPr>
+          <w:i/>
+          <w:sz w:val="18"/>
+          <w:color w:val="666666"/>
+        </w:rPr>
+        <w:t xml:space="preserve">Figure A.1 – Page d’accueil du site en production (vite-gourmand.fr).</w:t>
+      </w:r>
+    </w:p>
+    <w:p>
+      <w:pPr>
+        <w:keepNext/>
+        <w:jc w:val="center"/>
+      </w:pPr>
+      <w:r>
+        <w:drawing>
+          <wp:inline distT="0" distB="0" distL="0" distR="0">
+            <wp:extent cx="5303520" cy="3033600"/>
+            <wp:effectExtent l="0" t="0" r="0" b="0"/>
+            <wp:docPr id="311" name="Liste des menus"/>
+            <wp:cNvGraphicFramePr>
+              <a:graphicFrameLocks xmlns:a="http://schemas.openxmlformats.org/drawingml/2006/main" noChangeAspect="1"/>
+            </wp:cNvGraphicFramePr>
+            <a:graphic xmlns:a="http://schemas.openxmlformats.org/drawingml/2006/main">
+              <a:graphicData uri="http://schemas.openxmlformats.org/drawingml/2006/picture">
+                <pic:pic xmlns:pic="http://schemas.openxmlformats.org/drawingml/2006/picture">
+                  <pic:nvPicPr>
+                    <pic:cNvPr id="311" name="Liste des menus"/>
+                    <pic:cNvPicPr/>
+                  </pic:nvPicPr>
+                  <pic:blipFill>
+                    <a:blip r:embed="rId31"/>
+                    <a:stretch>
+                      <a:fillRect/>
+                    </a:stretch>
+                  </pic:blipFill>
+                  <pic:spPr>
+                    <a:xfrm>
+                      <a:off x="0" y="0"/>
+                      <a:ext cx="5303520" cy="3033600"/>
+                    </a:xfrm>
+                    <a:prstGeom prst="rect">
+                      <a:avLst/>
+                    </a:prstGeom>
+                    <a:ln w="9525">
+                      <a:solidFill>
+                        <a:srgbClr val="CCCCCC"/>
+                      </a:solidFill>
+                    </a:ln>
+                  </pic:spPr>
+                </pic:pic>
+              </a:graphicData>
+            </a:graphic>
+          </wp:inline>
+        </w:drawing>
+      </w:r>
+    </w:p>
+    <w:p>
+      <w:pPr>
+        <w:spacing w:after="360"/>
+        <w:jc w:val="center"/>
+      </w:pPr>
+      <w:r>
+        <w:rPr>
+          <w:i/>
+          <w:sz w:val="18"/>
+          <w:color w:val="666666"/>
+        </w:rPr>
+        <w:t xml:space="preserve">Figure A.2 – Liste des menus avec les filtres dynamiques (prix, thème, régime, nombre de personnes).</w:t>
+      </w:r>
+    </w:p>
+    <w:p>
+      <w:pPr>
+        <w:keepNext/>
+        <w:jc w:val="center"/>
+      </w:pPr>
+      <w:r>
+        <w:drawing>
+          <wp:inline distT="0" distB="0" distL="0" distR="0">
+            <wp:extent cx="5303520" cy="3033600"/>
+            <wp:effectExtent l="0" t="0" r="0" b="0"/>
+            <wp:docPr id="312" name="Détail menu"/>
+            <wp:cNvGraphicFramePr>
+              <a:graphicFrameLocks xmlns:a="http://schemas.openxmlformats.org/drawingml/2006/main" noChangeAspect="1"/>
+            </wp:cNvGraphicFramePr>
+            <a:graphic xmlns:a="http://schemas.openxmlformats.org/drawingml/2006/main">
+              <a:graphicData uri="http://schemas.openxmlformats.org/drawingml/2006/picture">
+                <pic:pic xmlns:pic="http://schemas.openxmlformats.org/drawingml/2006/picture">
+                  <pic:nvPicPr>
+                    <pic:cNvPr id="312" name="Détail menu"/>
+                    <pic:cNvPicPr/>
+                  </pic:nvPicPr>
+                  <pic:blipFill>
+                    <a:blip r:embed="rId32"/>
+                    <a:stretch>
+                      <a:fillRect/>
+                    </a:stretch>
+                  </pic:blipFill>
+                  <pic:spPr>
+                    <a:xfrm>
+                      <a:off x="0" y="0"/>
+                      <a:ext cx="5303520" cy="3033600"/>
+                    </a:xfrm>
+                    <a:prstGeom prst="rect">
+                      <a:avLst/>
+                    </a:prstGeom>
+                    <a:ln w="9525">
+                      <a:solidFill>
+                        <a:srgbClr val="CCCCCC"/>
+                      </a:solidFill>
+                    </a:ln>
+                  </pic:spPr>
+                </pic:pic>
+              </a:graphicData>
+            </a:graphic>
+          </wp:inline>
+        </w:drawing>
+      </w:r>
+    </w:p>
+    <w:p>
+      <w:pPr>
+        <w:spacing w:after="360"/>
+        <w:jc w:val="center"/>
+      </w:pPr>
+      <w:r>
+        <w:rPr>
+          <w:i/>
+          <w:sz w:val="18"/>
+          <w:color w:val="666666"/>
+        </w:rPr>
+        <w:t xml:space="preserve">Figure A.3 – Fiche d’un menu : prix, minimum de personnes, stock disponible et composition.</w:t>
+      </w:r>
+    </w:p>
+    <w:p>
+      <w:pPr>
+        <w:keepNext/>
+        <w:jc w:val="center"/>
+      </w:pPr>
+      <w:r>
+        <w:drawing>
+          <wp:inline distT="0" distB="0" distL="0" distR="0">
+            <wp:extent cx="5303520" cy="3033600"/>
+            <wp:effectExtent l="0" t="0" r="0" b="0"/>
+            <wp:docPr id="313" name="Commande"/>
+            <wp:cNvGraphicFramePr>
+              <a:graphicFrameLocks xmlns:a="http://schemas.openxmlformats.org/drawingml/2006/main" noChangeAspect="1"/>
+            </wp:cNvGraphicFramePr>
+            <a:graphic xmlns:a="http://schemas.openxmlformats.org/drawingml/2006/main">
+              <a:graphicData uri="http://schemas.openxmlformats.org/drawingml/2006/picture">
+                <pic:pic xmlns:pic="http://schemas.openxmlformats.org/drawingml/2006/picture">
+                  <pic:nvPicPr>
+                    <pic:cNvPr id="313" name="Commande"/>
+                    <pic:cNvPicPr/>
+                  </pic:nvPicPr>
+                  <pic:blipFill>
+                    <a:blip r:embed="rId33"/>
+                    <a:stretch>
+                      <a:fillRect/>
+                    </a:stretch>
+                  </pic:blipFill>
+                  <pic:spPr>
+                    <a:xfrm>
+                      <a:off x="0" y="0"/>
+                      <a:ext cx="5303520" cy="3033600"/>
+                    </a:xfrm>
+                    <a:prstGeom prst="rect">
+                      <a:avLst/>
+                    </a:prstGeom>
+                    <a:ln w="9525">
+                      <a:solidFill>
+                        <a:srgbClr val="CCCCCC"/>
+                      </a:solidFill>
+                    </a:ln>
+                  </pic:spPr>
+                </pic:pic>
+              </a:graphicData>
+            </a:graphic>
+          </wp:inline>
+        </w:drawing>
+      </w:r>
+    </w:p>
+    <w:p>
+      <w:pPr>
+        <w:spacing w:after="360"/>
+        <w:jc w:val="center"/>
+      </w:pPr>
+      <w:r>
+        <w:rPr>
+          <w:i/>
+          <w:sz w:val="18"/>
+          <w:color w:val="666666"/>
+        </w:rPr>
+        <w:t xml:space="preserve">Figure A.4 – Formulaire de commande : calcul du prix, options de livraison et prêt de matériel.</w:t>
+      </w:r>
+    </w:p>
+    <w:p>
+      <w:pPr>
+        <w:keepNext/>
+        <w:jc w:val="center"/>
+      </w:pPr>
+      <w:r>
+        <w:drawing>
+          <wp:inline distT="0" distB="0" distL="0" distR="0">
+            <wp:extent cx="5303520" cy="3033600"/>
+            <wp:effectExtent l="0" t="0" r="0" b="0"/>
+            <wp:docPr id="314" name="Mes commandes"/>
+            <wp:cNvGraphicFramePr>
+              <a:graphicFrameLocks xmlns:a="http://schemas.openxmlformats.org/drawingml/2006/main" noChangeAspect="1"/>
+            </wp:cNvGraphicFramePr>
+            <a:graphic xmlns:a="http://schemas.openxmlformats.org/drawingml/2006/main">
+              <a:graphicData uri="http://schemas.openxmlformats.org/drawingml/2006/picture">
+                <pic:pic xmlns:pic="http://schemas.openxmlformats.org/drawingml/2006/picture">
+                  <pic:nvPicPr>
+                    <pic:cNvPr id="314" name="Mes commandes"/>
+                    <pic:cNvPicPr/>
+                  </pic:nvPicPr>
+                  <pic:blipFill>
+                    <a:blip r:embed="rId34"/>
+                    <a:stretch>
+                      <a:fillRect/>
+                    </a:stretch>
+                  </pic:blipFill>
+                  <pic:spPr>
+                    <a:xfrm>
+                      <a:off x="0" y="0"/>
+                      <a:ext cx="5303520" cy="3033600"/>
+                    </a:xfrm>
+                    <a:prstGeom prst="rect">
+                      <a:avLst/>
+                    </a:prstGeom>
+                    <a:ln w="9525">
+                      <a:solidFill>
+                        <a:srgbClr val="CCCCCC"/>
+                      </a:solidFill>
+                    </a:ln>
+                  </pic:spPr>
+                </pic:pic>
+              </a:graphicData>
+            </a:graphic>
+          </wp:inline>
+        </w:drawing>
+      </w:r>
+    </w:p>
+    <w:p>
+      <w:pPr>
+        <w:spacing w:after="360"/>
+        <w:jc w:val="center"/>
+      </w:pPr>
+      <w:r>
+        <w:rPr>
+          <w:i/>
+          <w:sz w:val="18"/>
+          <w:color w:val="666666"/>
+        </w:rPr>
+        <w:t xml:space="preserve">Figure A.5 – Espace client « Mes commandes » avec le suivi des statuts.</w:t>
+      </w:r>
+    </w:p>
+    <w:p>
+      <w:pPr>
+        <w:keepNext/>
+        <w:jc w:val="center"/>
+      </w:pPr>
+      <w:r>
+        <w:drawing>
+          <wp:inline distT="0" distB="0" distL="0" distR="0">
+            <wp:extent cx="5303520" cy="3033600"/>
+            <wp:effectExtent l="0" t="0" r="0" b="0"/>
+            <wp:docPr id="315" name="Dashboard employé"/>
+            <wp:cNvGraphicFramePr>
+              <a:graphicFrameLocks xmlns:a="http://schemas.openxmlformats.org/drawingml/2006/main" noChangeAspect="1"/>
+            </wp:cNvGraphicFramePr>
+            <a:graphic xmlns:a="http://schemas.openxmlformats.org/drawingml/2006/main">
+              <a:graphicData uri="http://schemas.openxmlformats.org/drawingml/2006/picture">
+                <pic:pic xmlns:pic="http://schemas.openxmlformats.org/drawingml/2006/picture">
+                  <pic:nvPicPr>
+                    <pic:cNvPr id="315" name="Dashboard employé"/>
+                    <pic:cNvPicPr/>
+                  </pic:nvPicPr>
+                  <pic:blipFill>
+                    <a:blip r:embed="rId35"/>
+                    <a:stretch>
+                      <a:fillRect/>
+                    </a:stretch>
+                  </pic:blipFill>
+                  <pic:spPr>
+                    <a:xfrm>
+                      <a:off x="0" y="0"/>
+                      <a:ext cx="5303520" cy="3033600"/>
+                    </a:xfrm>
+                    <a:prstGeom prst="rect">
+                      <a:avLst/>
+                    </a:prstGeom>
+                    <a:ln w="9525">
+                      <a:solidFill>
+                        <a:srgbClr val="CCCCCC"/>
+                      </a:solidFill>
+                    </a:ln>
+                  </pic:spPr>
+                </pic:pic>
+              </a:graphicData>
+            </a:graphic>
+          </wp:inline>
+        </w:drawing>
+      </w:r>
+    </w:p>
+    <w:p>
+      <w:pPr>
+        <w:spacing w:after="360"/>
+        <w:jc w:val="center"/>
+      </w:pPr>
+      <w:r>
+        <w:rPr>
+          <w:i/>
+          <w:sz w:val="18"/>
+          <w:color w:val="666666"/>
+        </w:rPr>
+        <w:t xml:space="preserve">Figure A.6 – Tableau de bord employé : gestion et changement de statut des commandes.</w:t>
+      </w:r>
+    </w:p>
+    <w:p>
+      <w:pPr>
+        <w:keepNext/>
+        <w:jc w:val="center"/>
+      </w:pPr>
+      <w:r>
+        <w:drawing>
+          <wp:inline distT="0" distB="0" distL="0" distR="0">
+            <wp:extent cx="5303520" cy="3033600"/>
+            <wp:effectExtent l="0" t="0" r="0" b="0"/>
+            <wp:docPr id="316" name="Dashboard administrateur"/>
+            <wp:cNvGraphicFramePr>
+              <a:graphicFrameLocks xmlns:a="http://schemas.openxmlformats.org/drawingml/2006/main" noChangeAspect="1"/>
+            </wp:cNvGraphicFramePr>
+            <a:graphic xmlns:a="http://schemas.openxmlformats.org/drawingml/2006/main">
+              <a:graphicData uri="http://schemas.openxmlformats.org/drawingml/2006/picture">
+                <pic:pic xmlns:pic="http://schemas.openxmlformats.org/drawingml/2006/picture">
+                  <pic:nvPicPr>
+                    <pic:cNvPr id="316" name="Dashboard administrateur"/>
+                    <pic:cNvPicPr/>
+                  </pic:nvPicPr>
+                  <pic:blipFill>
+                    <a:blip r:embed="rId36"/>
+                    <a:stretch>
+                      <a:fillRect/>
+                    </a:stretch>
+                  </pic:blipFill>
+                  <pic:spPr>
+                    <a:xfrm>
+                      <a:off x="0" y="0"/>
+                      <a:ext cx="5303520" cy="3033600"/>
+                    </a:xfrm>
+                    <a:prstGeom prst="rect">
+                      <a:avLst/>
+                    </a:prstGeom>
+                    <a:ln w="9525">
+                      <a:solidFill>
+                        <a:srgbClr val="CCCCCC"/>
+                      </a:solidFill>
+                    </a:ln>
+                  </pic:spPr>
+                </pic:pic>
+              </a:graphicData>
+            </a:graphic>
+          </wp:inline>
+        </w:drawing>
+      </w:r>
+    </w:p>
+    <w:p>
+      <w:pPr>
+        <w:spacing w:after="360"/>
+        <w:jc w:val="center"/>
+      </w:pPr>
+      <w:r>
+        <w:rPr>
+          <w:i/>
+          <w:sz w:val="18"/>
+          <w:color w:val="666666"/>
+        </w:rPr>
+        <w:t xml:space="preserve">Figure A.7 – Tableau de bord administrateur avec accès aux espaces d’administration.</w:t>
+      </w:r>
+    </w:p>
+    <w:p>
+      <w:pPr>
+        <w:keepNext/>
+        <w:jc w:val="center"/>
+      </w:pPr>
+      <w:r>
+        <w:drawing>
+          <wp:inline distT="0" distB="0" distL="0" distR="0">
+            <wp:extent cx="5303520" cy="3033600"/>
+            <wp:effectExtent l="0" t="0" r="0" b="0"/>
+            <wp:docPr id="317" name="Statistiques NoSQL"/>
+            <wp:cNvGraphicFramePr>
+              <a:graphicFrameLocks xmlns:a="http://schemas.openxmlformats.org/drawingml/2006/main" noChangeAspect="1"/>
+            </wp:cNvGraphicFramePr>
+            <a:graphic xmlns:a="http://schemas.openxmlformats.org/drawingml/2006/main">
+              <a:graphicData uri="http://schemas.openxmlformats.org/drawingml/2006/picture">
+                <pic:pic xmlns:pic="http://schemas.openxmlformats.org/drawingml/2006/picture">
+                  <pic:nvPicPr>
+                    <pic:cNvPr id="317" name="Statistiques NoSQL"/>
+                    <pic:cNvPicPr/>
+                  </pic:nvPicPr>
+                  <pic:blipFill>
+                    <a:blip r:embed="rId37"/>
+                    <a:stretch>
+                      <a:fillRect/>
+                    </a:stretch>
+                  </pic:blipFill>
+                  <pic:spPr>
+                    <a:xfrm>
+                      <a:off x="0" y="0"/>
+                      <a:ext cx="5303520" cy="3033600"/>
+                    </a:xfrm>
+                    <a:prstGeom prst="rect">
+                      <a:avLst/>
+                    </a:prstGeom>
+                    <a:ln w="9525">
+                      <a:solidFill>
+                        <a:srgbClr val="CCCCCC"/>
+                      </a:solidFill>
+                    </a:ln>
+                  </pic:spPr>
+                </pic:pic>
+              </a:graphicData>
+            </a:graphic>
+          </wp:inline>
+        </w:drawing>
+      </w:r>
+    </w:p>
+    <w:p>
+      <w:pPr>
+        <w:spacing w:after="360"/>
+        <w:jc w:val="center"/>
+      </w:pPr>
+      <w:r>
+        <w:rPr>
+          <w:i/>
+          <w:sz w:val="18"/>
+          <w:color w:val="666666"/>
+        </w:rPr>
+        <w:t xml:space="preserve">Figure A.8 – Statistiques des commandes et du chiffre d’affaires par menu (données MongoDB).</w:t>
+      </w:r>
+    </w:p>
+    <w:p>
+      <w:pPr>
+        <w:keepNext/>
+        <w:jc w:val="center"/>
+      </w:pPr>
+      <w:r>
+        <w:drawing>
+          <wp:inline distT="0" distB="0" distL="0" distR="0">
+            <wp:extent cx="5303520" cy="2826776"/>
+            <wp:effectExtent l="0" t="0" r="0" b="0"/>
+            <wp:docPr id="410" name="Mes donnees RGPD"/>
+            <wp:cNvGraphicFramePr>
+              <a:graphicFrameLocks xmlns:a="http://schemas.openxmlformats.org/drawingml/2006/main" noChangeAspect="1"/>
+            </wp:cNvGraphicFramePr>
+            <a:graphic xmlns:a="http://schemas.openxmlformats.org/drawingml/2006/main">
+              <a:graphicData uri="http://schemas.openxmlformats.org/drawingml/2006/picture">
+                <pic:pic xmlns:pic="http://schemas.openxmlformats.org/drawingml/2006/picture">
+                  <pic:nvPicPr>
+                    <pic:cNvPr id="410" name="Mes donnees RGPD"/>
+                    <pic:cNvPicPr/>
+                  </pic:nvPicPr>
+                  <pic:blipFill>
+                    <a:blip r:embed="rId41"/>
+                    <a:stretch>
+                      <a:fillRect/>
+                    </a:stretch>
+                  </pic:blipFill>
+                  <pic:spPr>
+                    <a:xfrm>
+                      <a:off x="0" y="0"/>
+                      <a:ext cx="5303520" cy="2826776"/>
+                    </a:xfrm>
+                    <a:prstGeom prst="rect">
+                      <a:avLst/>
+                    </a:prstGeom>
+                    <a:ln w="9525">
+                      <a:solidFill>
+                        <a:srgbClr val="CCCCCC"/>
+                      </a:solidFill>
+                    </a:ln>
+                  </pic:spPr>
+                </pic:pic>
+              </a:graphicData>
+            </a:graphic>
+          </wp:inline>
+        </w:drawing>
+      </w:r>
+    </w:p>
+    <w:p>
+      <w:pPr>
+        <w:spacing w:after="360"/>
+        <w:jc w:val="center"/>
+      </w:pPr>
+      <w:r>
+        <w:rPr>
+          <w:i/>
+          <w:sz w:val="18"/>
+          <w:color w:val="666666"/>
+        </w:rPr>
+        <w:t xml:space="preserve">Figure A.9 – Page RGPD « Mes données » : accès, export JSON, rectification et suppression du compte.</w:t>
+      </w:r>
+    </w:p>
+    <w:p>
+      <w:pPr>
+        <w:keepNext/>
+        <w:jc w:val="center"/>
+      </w:pPr>
+      <w:r>
+        <w:drawing>
+          <wp:inline distT="0" distB="0" distL="0" distR="0">
+            <wp:extent cx="2400000" cy="4348800"/>
+            <wp:effectExtent l="0" t="0" r="0" b="0"/>
+            <wp:docPr id="411" name="Version mobile"/>
+            <wp:cNvGraphicFramePr>
+              <a:graphicFrameLocks xmlns:a="http://schemas.openxmlformats.org/drawingml/2006/main" noChangeAspect="1"/>
+            </wp:cNvGraphicFramePr>
+            <a:graphic xmlns:a="http://schemas.openxmlformats.org/drawingml/2006/main">
+              <a:graphicData uri="http://schemas.openxmlformats.org/drawingml/2006/picture">
+                <pic:pic xmlns:pic="http://schemas.openxmlformats.org/drawingml/2006/picture">
+                  <pic:nvPicPr>
+                    <pic:cNvPr id="411" name="Version mobile"/>
+                    <pic:cNvPicPr/>
+                  </pic:nvPicPr>
+                  <pic:blipFill>
+                    <a:blip r:embed="rId43"/>
+                    <a:stretch>
+                      <a:fillRect/>
+                    </a:stretch>
+                  </pic:blipFill>
+                  <pic:spPr>
+                    <a:xfrm>
+                      <a:off x="0" y="0"/>
+                      <a:ext cx="2400000" cy="4348800"/>
+                    </a:xfrm>
+                    <a:prstGeom prst="rect">
+                      <a:avLst/>
+                    </a:prstGeom>
+                    <a:ln w="9525">
+                      <a:solidFill>
+                        <a:srgbClr val="CCCCCC"/>
+                      </a:solidFill>
+                    </a:ln>
+                  </pic:spPr>
+                </pic:pic>
+              </a:graphicData>
+            </a:graphic>
+          </wp:inline>
+        </w:drawing>
+      </w:r>
+    </w:p>
+    <w:p>
+      <w:pPr>
+        <w:spacing w:after="360"/>
+        <w:jc w:val="center"/>
+      </w:pPr>
+      <w:r>
+        <w:rPr>
+          <w:i/>
+          <w:sz w:val="18"/>
+          <w:color w:val="666666"/>
+        </w:rPr>
+        <w:t xml:space="preserve">Figure A.10 – Affichage responsive sur mobile (menu hamburger et mise en page adaptée).</w:t>
       </w:r>
     </w:p>
     <w:bookmarkEnd w:id="140"/>

</xml_diff>